<commit_message>
Update runbook, decisions, and the report: verification now runs both sides and compares
</commit_message>
<xml_diff>
--- a/report/Project-Report.docx
+++ b/report/Project-Report.docx
@@ -470,7 +470,7 @@
         <w:spacing w:after="160" w:line="276"/>
       </w:pPr>
       <w:r>
-        <w:t xml:space="preserve">Verification is the heart of what we sell, so I want to explain what it is meant to do, and then tell you exactly how much of it works right now. I tested this part carefully.</w:t>
+        <w:t xml:space="preserve">Verification is the heart of what we sell, so I want to explain what it does, because this is the part we just made real.</w:t>
       </w:r>
     </w:p>
     <w:p>
@@ -487,7 +487,7 @@
         <w:spacing w:after="160" w:line="276"/>
       </w:pPr>
       <w:r>
-        <w:t xml:space="preserve">The promise is simple to say. When we rewrite a piece of COBOL into Java, we want to prove the new Java behaves exactly like the old code. The way you do that is with test cases. A test case is an input and the output the old system gives for that input. You run the new Java on the same input and check you get the same output. Do that for enough cases and you can trust the new piece.</w:t>
+        <w:t xml:space="preserve">The promise is simple to say. When we rewrite a piece of COBOL into Java, we want to prove the new Java behaves exactly like the old code. The way you do that is with test cases. A test case is a set of inputs. You run the old COBOL on those inputs to get the right answer, you run the new Java on the same inputs, and you check they match. Do that for enough cases and you can trust the new piece.</w:t>
       </w:r>
     </w:p>
     <w:p>
@@ -496,15 +496,23 @@
         <w:spacing w:after="100" w:before="220"/>
       </w:pPr>
       <w:r>
-        <w:t xml:space="preserve">What actually works today</w:t>
-      </w:r>
-    </w:p>
-    <w:p>
-      <w:pPr>
-        <w:spacing w:after="160" w:line="276"/>
-      </w:pPr>
-      <w:r>
-        <w:t xml:space="preserve">The parts that manage all of this are built and they work. You can add test cases by hand. The AI can draft cases for you to confirm. The tool stores the cases, runs a check, records a pass or fail, and gives a clear reason when something does not match. I ran all of that and it works.</w:t>
+        <w:t xml:space="preserve">What it does now</w:t>
+      </w:r>
+    </w:p>
+    <w:p>
+      <w:pPr>
+        <w:spacing w:after="160" w:line="276"/>
+      </w:pPr>
+      <w:r>
+        <w:t xml:space="preserve">It actually runs both sides. When you press run, the engine compiles and runs the original COBOL to get the true expected output, then compiles and runs the approved Java the same way, and compares the two. A person no longer types in the expected output. The old COBOL gives us the right answer. The AI can still suggest input cases, which a person confirms.</w:t>
+      </w:r>
+    </w:p>
+    <w:p>
+      <w:pPr>
+        <w:spacing w:after="160" w:line="276"/>
+      </w:pPr>
+      <w:r>
+        <w:t xml:space="preserve">I proved this end to end on a small interest program. The engine ran the COBOL and a correct Java and they matched, so it passed. Then I changed the Java to use the wrong rate, ran it again, and the engine caught the difference and showed exactly where the two outputs differed. That is the real thing working, not a stand in.</w:t>
       </w:r>
     </w:p>
     <w:p>
@@ -513,31 +521,32 @@
         <w:spacing w:after="100" w:before="220"/>
       </w:pPr>
       <w:r>
-        <w:t xml:space="preserve">The honest gap</w:t>
-      </w:r>
-    </w:p>
-    <w:p>
-      <w:pPr>
-        <w:spacing w:after="160" w:line="276"/>
-      </w:pPr>
-      <w:r>
-        <w:t xml:space="preserve">Here is the part I have to be straight about. Today the tool does not actually run the new Java. When you do a check, the tool compares an expected output against an output that you hand it. It does not compile the Java, it does not run it, and it does not produce that output itself. I proved this three ways: I tested it live and the result only depended on the text I typed in, the written API notes say the piece that runs the Java is a later step, and I read the code and there is nothing in there that compiles or runs anything.</w:t>
-      </w:r>
-    </w:p>
-    <w:p>
-      <w:pPr>
-        <w:spacing w:after="160" w:line="276"/>
-      </w:pPr>
-      <w:r>
-        <w:t xml:space="preserve">So right now a person types in what the Java produced, and the tool checks that against what was expected. The comparison is real and it is careful. But the engine that actually runs the new Java, and ideally runs the old code too, to produce those outputs on its own, is not built yet.</w:t>
-      </w:r>
-    </w:p>
-    <w:p>
-      <w:pPr>
-        <w:spacing w:after="160" w:line="276"/>
-      </w:pPr>
-      <w:r>
-        <w:t xml:space="preserve">Why this matters so much: it would be easy to look at a row of green passed checks and think the system proved the Java is correct. It did not. A human supplied the answer it checked. Until we build the part that runs the code itself, verification is a careful assistant, not the proof we want it to be. This is the single most important thing to finish.</w:t>
+        <w:t xml:space="preserve">How it stays safe and fair</w:t>
+      </w:r>
+    </w:p>
+    <w:p>
+      <w:pPr>
+        <w:spacing w:after="160" w:line="276"/>
+      </w:pPr>
+      <w:r>
+        <w:t xml:space="preserve">Each run happens in its own separate process, in a throwaway folder, with a hard time limit that stops a program that runs too long. The comparison has plain options you can see: trim trailing spaces, and allow a small numeric difference. Whatever was used is shown with the result. A difference that is only formatting is flagged apart from a real difference in behavior, so the two are never mixed up.</w:t>
+      </w:r>
+    </w:p>
+    <w:p>
+      <w:pPr>
+        <w:pStyle w:val="Heading2"/>
+        <w:spacing w:after="100" w:before="220"/>
+      </w:pPr>
+      <w:r>
+        <w:t xml:space="preserve">The honest limits</w:t>
+      </w:r>
+    </w:p>
+    <w:p>
+      <w:pPr>
+        <w:spacing w:after="160" w:line="276"/>
+      </w:pPr>
+      <w:r>
+        <w:t xml:space="preserve">A few things to be straight about. The safety is process level, not a locked down container yet, so for production near a bank each run should later go inside stronger isolation. The checks are only as good as the inputs we give them, so a thin set of cases proves less. And it runs programs that read standard input and write standard output, and can stage input files, but a program made of several COBOL pieces that call each other would also need those pieces.</w:t>
       </w:r>
     </w:p>
     <w:p>
@@ -735,7 +744,7 @@
         <w:spacing w:after="80" w:line="276"/>
       </w:pPr>
       <w:r>
-        <w:t xml:space="preserve">The verification case management and the output comparison (with the big caveat from section 7 that it does not run the Java itself).</w:t>
+        <w:t xml:space="preserve">Verification that really runs both sides. It compiles and runs the original COBOL and the new Java, compares them, and shows a real pass or fail with a diff on a failure. This is the core, and it works now.</w:t>
       </w:r>
     </w:p>
     <w:p>
@@ -761,7 +770,7 @@
         <w:spacing w:after="80" w:line="276"/>
       </w:pPr>
       <w:r>
-        <w:t xml:space="preserve">All the automated tests pass. There are 45 of them across the three parts, and every one passed.</w:t>
+        <w:t xml:space="preserve">All the automated tests pass. There are 54 of them across the three parts, including new ones that compile and run real COBOL and real Java, and every one passed.</w:t>
       </w:r>
     </w:p>
     <w:p>
@@ -799,46 +808,20 @@
         <w:spacing w:after="160" w:line="276"/>
       </w:pPr>
       <w:r>
-        <w:t xml:space="preserve">Now the honest other side. Some things look further along than they are, so here is where the gaps are.</w:t>
-      </w:r>
-    </w:p>
-    <w:p>
-      <w:pPr>
-        <w:pStyle w:val="ListParagraph"/>
-        <w:numPr>
-          <w:ilvl w:val="0"/>
-          <w:numId w:val="1"/>
-        </w:numPr>
-        <w:spacing w:after="80" w:line="276"/>
-      </w:pPr>
-      <w:r>
-        <w:t xml:space="preserve">Verification does not run the Java. This is the big one. As I explained in section 7, today a person supplies the output and the tool only compares it. The engine that compiles and runs the new code is not built. This is the most important missing piece, because it is the core promise.</w:t>
-      </w:r>
-    </w:p>
-    <w:p>
-      <w:pPr>
-        <w:pStyle w:val="ListParagraph"/>
-        <w:numPr>
-          <w:ilvl w:val="0"/>
-          <w:numId w:val="1"/>
-        </w:numPr>
-        <w:spacing w:after="80" w:line="276"/>
-      </w:pPr>
-      <w:r>
-        <w:t xml:space="preserve">The AI Java translation is a first draft, not finished code. On my test it got the shape right but left notes saying where it still needed work, and it wrapped the code in some extra formatting. It is a useful head start, but an engineer has to finish it. Part of that is because we are running a cheap AI model right now.</w:t>
-      </w:r>
-    </w:p>
-    <w:p>
-      <w:pPr>
-        <w:pStyle w:val="ListParagraph"/>
-        <w:numPr>
-          <w:ilvl w:val="0"/>
-          <w:numId w:val="1"/>
-        </w:numPr>
-        <w:spacing w:after="80" w:line="276"/>
-      </w:pPr>
-      <w:r>
-        <w:t xml:space="preserve">The cheap AI model. We are on a low cost model at the moment. It is surprisingly good at explaining code, but its Java drafts need real human cleanup. A stronger model would help the translation.</w:t>
+        <w:t xml:space="preserve">Now the honest other side. Some things still need work.</w:t>
+      </w:r>
+    </w:p>
+    <w:p>
+      <w:pPr>
+        <w:pStyle w:val="ListParagraph"/>
+        <w:numPr>
+          <w:ilvl w:val="0"/>
+          <w:numId w:val="1"/>
+        </w:numPr>
+        <w:spacing w:after="80" w:line="276"/>
+      </w:pPr>
+      <w:r>
+        <w:t xml:space="preserve">The AI Java translation is a draft, not finished code. It is a stronger draft now that we moved to a better model, but a person still reviews and finishes it before it is approved. That human check is the design, not a gap, so plan for an engineer in the loop.</w:t>
       </w:r>
     </w:p>
     <w:p>
@@ -852,6 +835,19 @@
       </w:pPr>
       <w:r>
         <w:t xml:space="preserve">The dependency map could be smarter. It correctly finds that one program calls another, but it does not yet connect that mention back to the actual uploaded file for it. So it shows them as two separate dots instead of one.</w:t>
+      </w:r>
+    </w:p>
+    <w:p>
+      <w:pPr>
+        <w:pStyle w:val="ListParagraph"/>
+        <w:numPr>
+          <w:ilvl w:val="0"/>
+          <w:numId w:val="1"/>
+        </w:numPr>
+        <w:spacing w:after="80" w:line="276"/>
+      </w:pPr>
+      <w:r>
+        <w:t xml:space="preserve">The verification sandbox is process level, not a locked down container. It runs each program in its own process with a hard time limit, which is a safe start, but a setup near a bank should wrap each run in stronger isolation later.</w:t>
       </w:r>
     </w:p>
     <w:p>
@@ -881,33 +877,33 @@
         <w:spacing w:after="160" w:line="276"/>
       </w:pPr>
       <w:r>
-        <w:t xml:space="preserve">Here is the to do list, most important first, in plain order.</w:t>
-      </w:r>
-    </w:p>
-    <w:p>
-      <w:pPr>
-        <w:pStyle w:val="ListParagraph"/>
-        <w:numPr>
-          <w:ilvl w:val="0"/>
-          <w:numId w:val="1"/>
-        </w:numPr>
-        <w:spacing w:after="80" w:line="276"/>
-      </w:pPr>
-      <w:r>
-        <w:t xml:space="preserve">Build the engine that actually runs the new Java, and ideally the old code too, and compares them on its own. This is what turns verification from a careful assistant into real proof. Without it, we cannot honestly tell a bank we proved the match. Everything else is less important than this.</w:t>
-      </w:r>
-    </w:p>
-    <w:p>
-      <w:pPr>
-        <w:pStyle w:val="ListParagraph"/>
-        <w:numPr>
-          <w:ilvl w:val="0"/>
-          <w:numId w:val="1"/>
-        </w:numPr>
-        <w:spacing w:after="80" w:line="276"/>
-      </w:pPr>
-      <w:r>
-        <w:t xml:space="preserve">Improve the translation. A better AI model, and some cleanup of the drafts it returns, so the Java that comes out needs less hand fixing.</w:t>
+        <w:t xml:space="preserve">Here is the to do list, most important first, in plain order. The big one, real verification, is done now, so this list is mostly about getting it ready to run near a real bank.</w:t>
+      </w:r>
+    </w:p>
+    <w:p>
+      <w:pPr>
+        <w:pStyle w:val="ListParagraph"/>
+        <w:numPr>
+          <w:ilvl w:val="0"/>
+          <w:numId w:val="1"/>
+        </w:numPr>
+        <w:spacing w:after="80" w:line="276"/>
+      </w:pPr>
+      <w:r>
+        <w:t xml:space="preserve">Harden the verification sandbox. Today each run is its own process with a time limit, which is safe enough for us. Before a bank, wrap each run in a locked down container with no network, so generated code can never reach anything it should not.</w:t>
+      </w:r>
+    </w:p>
+    <w:p>
+      <w:pPr>
+        <w:pStyle w:val="ListParagraph"/>
+        <w:numPr>
+          <w:ilvl w:val="0"/>
+          <w:numId w:val="1"/>
+        </w:numPr>
+        <w:spacing w:after="80" w:line="276"/>
+      </w:pPr>
+      <w:r>
+        <w:t xml:space="preserve">Keep improving the translation. The model is strong now, but tidy the drafts a little more so the Java needs even less hand fixing, and add more test inputs so verification covers more.</w:t>
       </w:r>
     </w:p>
     <w:p>
@@ -946,7 +942,7 @@
         <w:spacing w:after="80" w:line="276"/>
       </w:pPr>
       <w:r>
-        <w:t xml:space="preserve">Actually build and run the whole thing in containers. The setup for that is written but it has not been built or run on a machine that has the container tools, so it is unproven.</w:t>
+        <w:t xml:space="preserve">Actually build and run the whole thing in containers, and make sure GnuCOBOL is in the backend image so verification works there too. The container setup is written but has not been built or run yet.</w:t>
       </w:r>
     </w:p>
     <w:p>
@@ -980,7 +976,7 @@
         <w:spacing w:after="160" w:line="276"/>
       </w:pPr>
       <w:r>
-        <w:t xml:space="preserve">None of this is a disaster. The foundation is solid. But the first item, real verification, is the one that has to happen before we can sell the core promise with a straight face.</w:t>
+        <w:t xml:space="preserve">None of this is a disaster. The foundation is solid, and the core promise, proving the new Java matches the old COBOL, works now. The rest is making it ready for a real bank.</w:t>
       </w:r>
     </w:p>
     <w:p>

</xml_diff>